<commit_message>
Refactor project summary for AI kiosk: enhanced accessibility features and clarified functionality. Updated descriptions to emphasize non-contact ordering methods and improved user experience for diverse demographics.
</commit_message>
<xml_diff>
--- a/작품요약서_NO PROBLEM KIOSK.docx
+++ b/작품요약서_NO PROBLEM KIOSK.docx
@@ -965,28 +965,66 @@
             <w:r>
               <w:rPr>
                 <w:b/>
-                <w:sz w:val="22"/>
-                <w:szCs w:val="22"/>
-              </w:rPr>
-              <w:t xml:space="preserve">작품 주제: 터치·음성·손동작을 모두 지원하고, 연령대에 따라 화면이 자동으로 바뀌는 </w:t>
-            </w:r>
-            <w:proofErr w:type="spellStart"/>
+                <w:color w:val="000000"/>
+                <w:sz w:val="22"/>
+              </w:rPr>
+              <w:t xml:space="preserve">작품 주제: </w:t>
+            </w:r>
+            <w:r>
+              <w:rPr>
+                <w:b w:val="0"/>
+                <w:color w:val="000000"/>
+                <w:sz w:val="22"/>
+              </w:rPr>
+              <w:t>카메라와 AI가 손님의 나이와 불편함을 먼저 알아채고, 터치·손동작·음성으로 누구나 혼자 주문하도록 돕는 세로형 배리어프리 AI 키오스크 개발 (개발 언어: Python)</w:t>
+            </w:r>
+          </w:p>
+          <w:p>
+            <w:pPr>
+              <w:rPr>
+                <w:sz w:val="22"/>
+                <w:szCs w:val="22"/>
+              </w:rPr>
+            </w:pPr>
             <w:r>
               <w:rPr>
                 <w:b/>
-                <w:sz w:val="22"/>
-                <w:szCs w:val="22"/>
-              </w:rPr>
-              <w:t>배리어프리</w:t>
-            </w:r>
-            <w:proofErr w:type="spellEnd"/>
+                <w:color w:val="000000"/>
+                <w:sz w:val="22"/>
+              </w:rPr>
+              <w:t xml:space="preserve">1. 작품의 설명(제안하는 해법과 근거): </w:t>
+            </w:r>
+            <w:r>
+              <w:rPr>
+                <w:b w:val="0"/>
+                <w:color w:val="000000"/>
+                <w:sz w:val="22"/>
+              </w:rPr>
+              <w:t>어린이·어르신·눈이나 손이 불편한 분·외국인 누구나 도움 없이 주문할 수 있는 무인 주문 시스템입니다. 핵심 기능은 ① 학습된 CNN이 연령대를 인식해 어린이·일반·실버 모드로 자동 전환(다수결·쿨다운으로 깜빡임 방지), ② 손바닥 커서·집기·2초 멈춤(드웰)·좌우 휘두르기의 비접촉 제스처, ③ 눈이 불편한 손님에게 먼저 소리로 묻고 고대비 화면과 음성 주문을 바로 시작해 결과를 소리로 읽어 주는 음성 기능, ④ 한국어·영어·중국어 다국어(말한 언어로 자동 전환), ⑤ 명암 대비 21:1의 고대비 화면입니다. 27인치 세로 터치스크린(1080×1920)에 맞춰 큰 버튼과 접근성 버튼을 손이 닿는 아래쪽에 두었습니다.</w:t>
+            </w:r>
+          </w:p>
+          <w:p>
+            <w:pPr>
+              <w:rPr>
+                <w:sz w:val="22"/>
+                <w:szCs w:val="22"/>
+              </w:rPr>
+            </w:pPr>
             <w:r>
               <w:rPr>
                 <w:b/>
-                <w:sz w:val="22"/>
-                <w:szCs w:val="22"/>
-              </w:rPr>
-              <w:t xml:space="preserve"> AI 키오스크 개발 (개발 언어: Python)</w:t>
+                <w:color w:val="000000"/>
+                <w:sz w:val="22"/>
+              </w:rPr>
+              <w:t xml:space="preserve">2. 기존 작품과의 차이점: </w:t>
+            </w:r>
+            <w:r>
+              <w:rPr>
+                <w:b w:val="0"/>
+                <w:color w:val="000000"/>
+                <w:sz w:val="22"/>
+              </w:rPr>
+              <w:t>기존 키오스크의 '글자 크게'·'약자 모드'는 도움이 필요한 사람이 직접 버튼을 찾아야 하지만, 이 작품은 기계가 먼저 알아보고 맞춰 줍니다. 실험으로 한계를 확인한 기능(얼굴 단골 인식·엄지척 결제·인터넷 AI 분석)은 과감히 빼고, 개인을 알아보지 않는 안전한 기능만 남겼습니다. 일반 컴퓨터와 웹캠만으로 동작해 비용도 적습니다.</w:t>
             </w:r>
           </w:p>
           <w:p>
@@ -999,95 +1037,28 @@
             <w:r>
               <w:rPr>
                 <w:b/>
-                <w:sz w:val="22"/>
-                <w:szCs w:val="22"/>
-              </w:rPr>
-              <w:t xml:space="preserve">1. 작품의 설명: </w:t>
-            </w:r>
-            <w:proofErr w:type="spellStart"/>
-            <w:r>
-              <w:rPr>
-                <w:b/>
-                <w:sz w:val="22"/>
-                <w:szCs w:val="22"/>
-              </w:rPr>
-              <w:t>유니버셜</w:t>
-            </w:r>
-            <w:proofErr w:type="spellEnd"/>
-            <w:r>
-              <w:rPr>
-                <w:b/>
-                <w:sz w:val="22"/>
-                <w:szCs w:val="22"/>
-              </w:rPr>
-              <w:t xml:space="preserve"> 키오스크는 어린이·성인·노인·장애인·외국인 누구나 쉽게 주문할 수 있도록 만든 무인 주문 시스템입니다. 카메라로 연령대를 인식해 어린이 모드, 일반 모드, 실버 모드로 화면을 바꾸고, 손이 닿지 않는 사용자도 음성이나 손동작으로 주문할 수 있습니다. 다국어 전환과 </w:t>
-            </w:r>
-            <w:proofErr w:type="spellStart"/>
-            <w:r>
-              <w:rPr>
-                <w:b/>
-                <w:sz w:val="22"/>
-                <w:szCs w:val="22"/>
-              </w:rPr>
-              <w:t>고대비</w:t>
-            </w:r>
-            <w:proofErr w:type="spellEnd"/>
-            <w:r>
-              <w:rPr>
-                <w:b/>
-                <w:sz w:val="22"/>
-                <w:szCs w:val="22"/>
-              </w:rPr>
-              <w:t xml:space="preserve"> 모드도 지원하며, 카메라나 마이크가 없어도 데모 모드로 핵심 기능을 시연할 수 있습니다.</w:t>
-            </w:r>
-          </w:p>
-          <w:p>
-            <w:pPr>
-              <w:rPr>
-                <w:sz w:val="22"/>
-                <w:szCs w:val="22"/>
-              </w:rPr>
-            </w:pPr>
-            <w:r>
-              <w:rPr>
-                <w:b/>
-                <w:sz w:val="22"/>
-                <w:szCs w:val="22"/>
-              </w:rPr>
-              <w:t>2. 기존 작품과의 차이점: 기존 키오스크처럼 터치만 강요하지 않고, 터치·음성·손동작을 함께 제공해 접근성을 크게 높였습니다. 또한 기존 키오스크도 카메라와 마이크만 추가하면 적용할 수 있는 확장형 구조로 설계해 실용성을 높였습니다.</w:t>
-            </w:r>
-          </w:p>
-          <w:p>
-            <w:r>
-              <w:rPr>
-                <w:b/>
-                <w:sz w:val="22"/>
-                <w:szCs w:val="22"/>
-              </w:rPr>
-              <w:t xml:space="preserve">3. 결과 및 활용: 총 96개 테스트를 통과하며 기능의 안정성을 확인했습니다. 이 작품은 패스트푸드점뿐 아니라 공공 민원 키오스크, 병원, 학교 등 다양한 장소에 적용할 수 있으며, 디지털 소외를 줄이고 누구나 스스로 주문할 수 있도록 돕는 것이 목표입니다. 개인정보를 위해 얼굴 사진은 저장하지 않고, 익명 </w:t>
-            </w:r>
-            <w:r>
-              <w:rPr>
-                <w:rFonts w:hint="eastAsia"/>
-                <w:b/>
-                <w:sz w:val="22"/>
-                <w:szCs w:val="22"/>
-              </w:rPr>
-              <w:t>숫</w:t>
-            </w:r>
-            <w:r>
-              <w:rPr>
-                <w:b/>
-                <w:sz w:val="22"/>
-                <w:szCs w:val="22"/>
-              </w:rPr>
-              <w:t>자 정보만 로컬에 보관합니다.</w:t>
+                <w:color w:val="000000"/>
+                <w:sz w:val="22"/>
+              </w:rPr>
+              <w:t xml:space="preserve">3. 결과 및 활용: </w:t>
+            </w:r>
+            <w:r>
+              <w:rPr>
+                <w:b w:val="0"/>
+                <w:color w:val="000000"/>
+                <w:sz w:val="22"/>
+              </w:rPr>
+              <w:t>자동 테스트 99개를 모두 통과했고, 4가지 화면 모드 × 3개 언어 모두 세로 화면 안에 맞는 것을 확인했습니다. 카메라·인터넷이 없어도 데모 모드와 글자 입력으로 동작하며, 얼굴 사진과 개인 정보는 저장하지 않습니다. 패스트푸드점뿐 아니라 카페·병원·공공기관 무인 민원기 등에 적용해 디지털 소외를 줄일 수 있습니다.</w:t>
             </w:r>
           </w:p>
         </w:tc>
       </w:tr>
     </w:tbl>
-    <w:p/>
+    <w:p>
+      <w:pPr>
+        <w:spacing w:before="0" w:after="0" w:lineRule="exact" w:line="20"/>
+      </w:pPr>
+    </w:p>
     <w:sectPr>
       <w:pgSz w:w="11906" w:h="16837"/>
       <w:pgMar w:top="1417" w:right="1134" w:bottom="1417" w:left="1134" w:header="850" w:footer="850" w:gutter="0"/>

</xml_diff>